<commit_message>
Update Report for Project
</commit_message>
<xml_diff>
--- a/document/Report 2.docx
+++ b/document/Report 2.docx
@@ -1071,7 +1071,7 @@
     </w:p>
     <w:sdt>
       <w:sdtPr>
-        <w:id w:val="-1020032821"/>
+        <w:id w:val="287508637"/>
         <w:docPartObj>
           <w:docPartGallery w:val="Table of Contents"/>
           <w:docPartUnique w:val="1"/>
@@ -4890,7 +4890,7 @@
                 <w:szCs w:val="20"/>
                 <w:rtl w:val="0"/>
               </w:rPr>
-              <w:t xml:space="preserve">PvE battle vs. scripted AI opponent</w:t>
+              <w:t xml:space="preserve">PvE battle with guide vs. scripted AI opponent</w:t>
             </w:r>
           </w:p>
         </w:tc>
@@ -14813,8 +14813,11 @@
             </w:pPr>
             <w:r>
               <w:rPr>
-                <w:rtl w:val="0"/>
-              </w:rPr>
+                <w:sz w:val="22"/>
+                <w:szCs w:val="22"/>
+                <w:rtl w:val="0"/>
+              </w:rPr>
+              <w:t xml:space="preserve">S</w:t>
             </w:r>
           </w:p>
         </w:tc>
@@ -14986,11 +14989,8 @@
             </w:pPr>
             <w:r>
               <w:rPr>
-                <w:sz w:val="22"/>
-                <w:szCs w:val="22"/>
-                <w:rtl w:val="0"/>
-              </w:rPr>
-              <w:t xml:space="preserve">S</w:t>
+                <w:rtl w:val="0"/>
+              </w:rPr>
             </w:r>
           </w:p>
         </w:tc>
@@ -15024,7 +15024,7 @@
                 <w:szCs w:val="22"/>
                 <w:rtl w:val="0"/>
               </w:rPr>
-              <w:t xml:space="preserve">S</w:t>
+              <w:t xml:space="preserve">D</w:t>
             </w:r>
           </w:p>
         </w:tc>

</xml_diff>